<commit_message>
Add verified audit and mentor visualization pack
</commit_message>
<xml_diff>
--- a/submission_release/FINAL_PROJECT_REPORT.docx
+++ b/submission_release/FINAL_PROJECT_REPORT.docx
@@ -1387,7 +1387,7 @@
               <w:rPr>
                 <w:sz w:val="18"/>
               </w:rPr>
-              <w:t>92 staged/audit/focused/integrated checks; zero failures</w:t>
+              <w:t>103 staged/audit/focused/integrated checks; zero failures</w:t>
             </w:r>
           </w:p>
         </w:tc>
@@ -2109,7 +2109,7 @@
         <w:t xml:space="preserve">4.  </w:t>
       </w:r>
       <w:r>
-        <w:t>Fixed branch samples form an 81-dimensional joint LCA vector and a 13-mode PCA model.</w:t>
+        <w:t>Fixed branch samples form an 81-dimensional joint surface-deviation vector and a 13-mode PCA model.</w:t>
       </w:r>
     </w:p>
     <w:p>
@@ -3557,11 +3557,782 @@
     </w:p>
     <w:p>
       <w:pPr>
+        <w:pStyle w:val="Heading2"/>
+        <w:pageBreakBefore/>
+      </w:pPr>
+      <w:r>
+        <w:t>4.5 Technical Design Specification Alignment</w:t>
+      </w:r>
+    </w:p>
+    <w:p>
+      <w:r>
+        <w:t>The final architecture was traced against the primary technical design. The two measured ellipses provide the triaxial heart-scaffold dimensions: the coronary ellipse supplies a and b, while the cardiac-Z-aligned axis of the interventricular/LAD ellipse supplies c, with explicit quality handling for underconstrained partial arcs. These ellipses are scaffold measurements, not LAD or LCX path molds. Arteries retain their measured or generated surface-relative trajectories and are never snapped onto planar ellipse arcs.</w:t>
+      </w:r>
+    </w:p>
+    <w:tbl>
+      <w:tblPr>
+        <w:tblStyle w:val="TableGrid"/>
+        <w:tblW w:type="dxa" w:w="9360"/>
+        <w:tblLayout w:type="fixed"/>
+        <w:tblLook w:firstColumn="1" w:firstRow="1" w:lastColumn="0" w:lastRow="0" w:noHBand="0" w:noVBand="1" w:val="04A0"/>
+        <w:jc w:val="left"/>
+        <w:tblInd w:w="0" w:type="dxa"/>
+      </w:tblPr>
+      <w:tblGrid>
+        <w:gridCol w:w="2450"/>
+        <w:gridCol w:w="1680"/>
+        <w:gridCol w:w="5230"/>
+      </w:tblGrid>
+      <w:tr>
+        <w:trPr>
+          <w:cantSplit/>
+          <w:tblHeader w:val="true"/>
+          <w:cantSplit/>
+        </w:trPr>
+        <w:tc>
+          <w:tcPr>
+            <w:tcW w:type="dxa" w:w="2450"/>
+            <w:tcMar>
+              <w:top w:w="85" w:type="dxa"/>
+              <w:start w:w="120" w:type="dxa"/>
+              <w:bottom w:w="85" w:type="dxa"/>
+              <w:end w:w="120" w:type="dxa"/>
+            </w:tcMar>
+            <w:vAlign w:val="center"/>
+            <w:shd w:fill="EAF2FB"/>
+          </w:tcPr>
+          <w:p>
+            <w:pPr>
+              <w:jc w:val="center"/>
+            </w:pPr>
+            <w:r>
+              <w:rPr>
+                <w:b/>
+                <w:sz w:val="15"/>
+              </w:rPr>
+              <w:t>Design component</w:t>
+            </w:r>
+          </w:p>
+        </w:tc>
+        <w:tc>
+          <w:tcPr>
+            <w:tcW w:type="dxa" w:w="1680"/>
+            <w:tcMar>
+              <w:top w:w="85" w:type="dxa"/>
+              <w:start w:w="120" w:type="dxa"/>
+              <w:bottom w:w="85" w:type="dxa"/>
+              <w:end w:w="120" w:type="dxa"/>
+            </w:tcMar>
+            <w:vAlign w:val="center"/>
+            <w:shd w:fill="EAF2FB"/>
+          </w:tcPr>
+          <w:p>
+            <w:pPr>
+              <w:jc w:val="center"/>
+            </w:pPr>
+            <w:r>
+              <w:rPr>
+                <w:b/>
+                <w:sz w:val="15"/>
+              </w:rPr>
+              <w:t>Alignment</w:t>
+            </w:r>
+          </w:p>
+        </w:tc>
+        <w:tc>
+          <w:tcPr>
+            <w:tcW w:type="dxa" w:w="5230"/>
+            <w:tcMar>
+              <w:top w:w="85" w:type="dxa"/>
+              <w:start w:w="120" w:type="dxa"/>
+              <w:bottom w:w="85" w:type="dxa"/>
+              <w:end w:w="120" w:type="dxa"/>
+            </w:tcMar>
+            <w:vAlign w:val="center"/>
+            <w:shd w:fill="EAF2FB"/>
+          </w:tcPr>
+          <w:p>
+            <w:pPr>
+              <w:jc w:val="center"/>
+            </w:pPr>
+            <w:r>
+              <w:rPr>
+                <w:b/>
+                <w:sz w:val="15"/>
+              </w:rPr>
+              <w:t>Evidence / limitation</w:t>
+            </w:r>
+          </w:p>
+        </w:tc>
+      </w:tr>
+      <w:tr>
+        <w:trPr>
+          <w:cantSplit/>
+        </w:trPr>
+        <w:tc>
+          <w:tcPr>
+            <w:tcW w:type="dxa" w:w="2450"/>
+            <w:tcMar>
+              <w:top w:w="85" w:type="dxa"/>
+              <w:start w:w="120" w:type="dxa"/>
+              <w:bottom w:w="85" w:type="dxa"/>
+              <w:end w:w="120" w:type="dxa"/>
+            </w:tcMar>
+            <w:vAlign w:val="center"/>
+          </w:tcPr>
+          <w:p>
+            <w:pPr>
+              <w:jc w:val="left"/>
+            </w:pPr>
+            <w:r>
+              <w:rPr>
+                <w:sz w:val="15"/>
+              </w:rPr>
+              <w:t>Two anatomical planes</w:t>
+            </w:r>
+          </w:p>
+        </w:tc>
+        <w:tc>
+          <w:tcPr>
+            <w:tcW w:type="dxa" w:w="1680"/>
+            <w:tcMar>
+              <w:top w:w="85" w:type="dxa"/>
+              <w:start w:w="120" w:type="dxa"/>
+              <w:bottom w:w="85" w:type="dxa"/>
+              <w:end w:w="120" w:type="dxa"/>
+            </w:tcMar>
+            <w:vAlign w:val="center"/>
+          </w:tcPr>
+          <w:p>
+            <w:pPr>
+              <w:jc w:val="center"/>
+            </w:pPr>
+            <w:r>
+              <w:rPr>
+                <w:sz w:val="15"/>
+              </w:rPr>
+              <w:t>EQUIVALENT</w:t>
+            </w:r>
+          </w:p>
+        </w:tc>
+        <w:tc>
+          <w:tcPr>
+            <w:tcW w:type="dxa" w:w="5230"/>
+            <w:tcMar>
+              <w:top w:w="85" w:type="dxa"/>
+              <w:start w:w="120" w:type="dxa"/>
+              <w:bottom w:w="85" w:type="dxa"/>
+              <w:end w:w="120" w:type="dxa"/>
+            </w:tcMar>
+            <w:vAlign w:val="center"/>
+          </w:tcPr>
+          <w:p>
+            <w:pPr>
+              <w:jc w:val="left"/>
+            </w:pPr>
+            <w:r>
+              <w:rPr>
+                <w:sz w:val="15"/>
+              </w:rPr>
+              <w:t>Measured coronary and LAD references retained; the measured LAD plane differs materially from the simplified cross-product example and is the validated downstream reference.</w:t>
+            </w:r>
+          </w:p>
+        </w:tc>
+      </w:tr>
+      <w:tr>
+        <w:trPr>
+          <w:cantSplit/>
+        </w:trPr>
+        <w:tc>
+          <w:tcPr>
+            <w:tcW w:type="dxa" w:w="2450"/>
+            <w:tcMar>
+              <w:top w:w="85" w:type="dxa"/>
+              <w:start w:w="120" w:type="dxa"/>
+              <w:bottom w:w="85" w:type="dxa"/>
+              <w:end w:w="120" w:type="dxa"/>
+            </w:tcMar>
+            <w:vAlign w:val="center"/>
+          </w:tcPr>
+          <w:p>
+            <w:pPr>
+              <w:jc w:val="left"/>
+            </w:pPr>
+            <w:r>
+              <w:rPr>
+                <w:sz w:val="15"/>
+              </w:rPr>
+              <w:t>Two ellipses -&gt; ellipsoid</w:t>
+            </w:r>
+          </w:p>
+        </w:tc>
+        <w:tc>
+          <w:tcPr>
+            <w:tcW w:type="dxa" w:w="1680"/>
+            <w:tcMar>
+              <w:top w:w="85" w:type="dxa"/>
+              <w:start w:w="120" w:type="dxa"/>
+              <w:bottom w:w="85" w:type="dxa"/>
+              <w:end w:w="120" w:type="dxa"/>
+            </w:tcMar>
+            <w:vAlign w:val="center"/>
+          </w:tcPr>
+          <w:p>
+            <w:pPr>
+              <w:jc w:val="center"/>
+            </w:pPr>
+            <w:r>
+              <w:rPr>
+                <w:sz w:val="15"/>
+              </w:rPr>
+              <w:t>EXACT</w:t>
+            </w:r>
+          </w:p>
+        </w:tc>
+        <w:tc>
+          <w:tcPr>
+            <w:tcW w:type="dxa" w:w="5230"/>
+            <w:tcMar>
+              <w:top w:w="85" w:type="dxa"/>
+              <w:start w:w="120" w:type="dxa"/>
+              <w:bottom w:w="85" w:type="dxa"/>
+              <w:end w:w="120" w:type="dxa"/>
+            </w:tcMar>
+            <w:vAlign w:val="center"/>
+          </w:tcPr>
+          <w:p>
+            <w:pPr>
+              <w:jc w:val="left"/>
+            </w:pPr>
+            <w:r>
+              <w:rPr>
+                <w:sz w:val="15"/>
+              </w:rPr>
+              <w:t>Per-case a,b,c provenance is machine-traced for all eligible cases.</w:t>
+            </w:r>
+          </w:p>
+        </w:tc>
+      </w:tr>
+      <w:tr>
+        <w:trPr>
+          <w:cantSplit/>
+        </w:trPr>
+        <w:tc>
+          <w:tcPr>
+            <w:tcW w:type="dxa" w:w="2450"/>
+            <w:tcMar>
+              <w:top w:w="85" w:type="dxa"/>
+              <w:start w:w="120" w:type="dxa"/>
+              <w:bottom w:w="85" w:type="dxa"/>
+              <w:end w:w="120" w:type="dxa"/>
+            </w:tcMar>
+            <w:vAlign w:val="center"/>
+          </w:tcPr>
+          <w:p>
+            <w:pPr>
+              <w:jc w:val="left"/>
+            </w:pPr>
+            <w:r>
+              <w:rPr>
+                <w:sz w:val="15"/>
+              </w:rPr>
+              <w:t>u, v, offset representation</w:t>
+            </w:r>
+          </w:p>
+        </w:tc>
+        <w:tc>
+          <w:tcPr>
+            <w:tcW w:type="dxa" w:w="1680"/>
+            <w:tcMar>
+              <w:top w:w="85" w:type="dxa"/>
+              <w:start w:w="120" w:type="dxa"/>
+              <w:bottom w:w="85" w:type="dxa"/>
+              <w:end w:w="120" w:type="dxa"/>
+            </w:tcMar>
+            <w:vAlign w:val="center"/>
+          </w:tcPr>
+          <w:p>
+            <w:pPr>
+              <w:jc w:val="center"/>
+            </w:pPr>
+            <w:r>
+              <w:rPr>
+                <w:sz w:val="15"/>
+              </w:rPr>
+              <w:t>EQUIVALENT</w:t>
+            </w:r>
+          </w:p>
+        </w:tc>
+        <w:tc>
+          <w:tcPr>
+            <w:tcW w:type="dxa" w:w="5230"/>
+            <w:tcMar>
+              <w:top w:w="85" w:type="dxa"/>
+              <w:start w:w="120" w:type="dxa"/>
+              <w:bottom w:w="85" w:type="dxa"/>
+              <w:end w:w="120" w:type="dxa"/>
+            </w:tcMar>
+            <w:vAlign w:val="center"/>
+          </w:tcPr>
+          <w:p>
+            <w:pPr>
+              <w:jc w:val="left"/>
+            </w:pPr>
+            <w:r>
+              <w:rPr>
+                <w:sz w:val="15"/>
+              </w:rPr>
+              <w:t>24,657 eligible source points; maximum round-trip error 3.64e-14 mm.</w:t>
+            </w:r>
+          </w:p>
+        </w:tc>
+      </w:tr>
+      <w:tr>
+        <w:trPr>
+          <w:cantSplit/>
+        </w:trPr>
+        <w:tc>
+          <w:tcPr>
+            <w:tcW w:type="dxa" w:w="2450"/>
+            <w:tcMar>
+              <w:top w:w="85" w:type="dxa"/>
+              <w:start w:w="120" w:type="dxa"/>
+              <w:bottom w:w="85" w:type="dxa"/>
+              <w:end w:w="120" w:type="dxa"/>
+            </w:tcMar>
+            <w:vAlign w:val="center"/>
+          </w:tcPr>
+          <w:p>
+            <w:pPr>
+              <w:jc w:val="left"/>
+            </w:pPr>
+            <w:r>
+              <w:rPr>
+                <w:sz w:val="15"/>
+              </w:rPr>
+              <w:t>Joint deviation PCA</w:t>
+            </w:r>
+          </w:p>
+        </w:tc>
+        <w:tc>
+          <w:tcPr>
+            <w:tcW w:type="dxa" w:w="1680"/>
+            <w:tcMar>
+              <w:top w:w="85" w:type="dxa"/>
+              <w:start w:w="120" w:type="dxa"/>
+              <w:bottom w:w="85" w:type="dxa"/>
+              <w:end w:w="120" w:type="dxa"/>
+            </w:tcMar>
+            <w:vAlign w:val="center"/>
+          </w:tcPr>
+          <w:p>
+            <w:pPr>
+              <w:jc w:val="center"/>
+            </w:pPr>
+            <w:r>
+              <w:rPr>
+                <w:sz w:val="15"/>
+              </w:rPr>
+              <w:t>EXACT</w:t>
+            </w:r>
+          </w:p>
+        </w:tc>
+        <w:tc>
+          <w:tcPr>
+            <w:tcW w:type="dxa" w:w="5230"/>
+            <w:tcMar>
+              <w:top w:w="85" w:type="dxa"/>
+              <w:start w:w="120" w:type="dxa"/>
+              <w:bottom w:w="85" w:type="dxa"/>
+              <w:end w:w="120" w:type="dxa"/>
+            </w:tcMar>
+            <w:vAlign w:val="center"/>
+          </w:tcPr>
+          <w:p>
+            <w:pPr>
+              <w:jc w:val="left"/>
+            </w:pPr>
+            <w:r>
+              <w:rPr>
+                <w:sz w:val="15"/>
+              </w:rPr>
+              <w:t>81 surface-relative features: LMCA 5 + LAD 12 + LCX 10, each with tangent-u, tangent-v and normal coefficients; not raw XYZ PCA.</w:t>
+            </w:r>
+          </w:p>
+        </w:tc>
+      </w:tr>
+      <w:tr>
+        <w:trPr>
+          <w:cantSplit/>
+        </w:trPr>
+        <w:tc>
+          <w:tcPr>
+            <w:tcW w:type="dxa" w:w="2450"/>
+            <w:tcMar>
+              <w:top w:w="85" w:type="dxa"/>
+              <w:start w:w="120" w:type="dxa"/>
+              <w:bottom w:w="85" w:type="dxa"/>
+              <w:end w:w="120" w:type="dxa"/>
+            </w:tcMar>
+            <w:vAlign w:val="center"/>
+          </w:tcPr>
+          <w:p>
+            <w:pPr>
+              <w:jc w:val="left"/>
+            </w:pPr>
+            <w:r>
+              <w:rPr>
+                <w:sz w:val="15"/>
+              </w:rPr>
+              <w:t>B-spline chart</w:t>
+            </w:r>
+          </w:p>
+        </w:tc>
+        <w:tc>
+          <w:tcPr>
+            <w:tcW w:type="dxa" w:w="1680"/>
+            <w:tcMar>
+              <w:top w:w="85" w:type="dxa"/>
+              <w:start w:w="120" w:type="dxa"/>
+              <w:bottom w:w="85" w:type="dxa"/>
+              <w:end w:w="120" w:type="dxa"/>
+            </w:tcMar>
+            <w:vAlign w:val="center"/>
+          </w:tcPr>
+          <w:p>
+            <w:pPr>
+              <w:jc w:val="center"/>
+            </w:pPr>
+            <w:r>
+              <w:rPr>
+                <w:sz w:val="15"/>
+              </w:rPr>
+              <w:t>PARTIAL</w:t>
+            </w:r>
+          </w:p>
+        </w:tc>
+        <w:tc>
+          <w:tcPr>
+            <w:tcW w:type="dxa" w:w="5230"/>
+            <w:tcMar>
+              <w:top w:w="85" w:type="dxa"/>
+              <w:start w:w="120" w:type="dxa"/>
+              <w:bottom w:w="85" w:type="dxa"/>
+              <w:end w:w="120" w:type="dxa"/>
+            </w:tcMar>
+            <w:vAlign w:val="center"/>
+          </w:tcPr>
+          <w:p>
+            <w:pPr>
+              <w:jc w:val="left"/>
+            </w:pPr>
+            <w:r>
+              <w:rPr>
+                <w:sz w:val="15"/>
+              </w:rPr>
+              <w:t>Protected shape-preserving XYZ spline is re-parameterized into the ellipsoid basis. A literal u/v candidate was evaluated but not promoted: 26/52 LAD controls touch a polar singularity and P95 maximum path difference is 5.37 mm.</w:t>
+            </w:r>
+          </w:p>
+        </w:tc>
+      </w:tr>
+      <w:tr>
+        <w:trPr>
+          <w:cantSplit/>
+        </w:trPr>
+        <w:tc>
+          <w:tcPr>
+            <w:tcW w:type="dxa" w:w="2450"/>
+            <w:tcMar>
+              <w:top w:w="85" w:type="dxa"/>
+              <w:start w:w="120" w:type="dxa"/>
+              <w:bottom w:w="85" w:type="dxa"/>
+              <w:end w:w="120" w:type="dxa"/>
+            </w:tcMar>
+            <w:vAlign w:val="center"/>
+          </w:tcPr>
+          <w:p>
+            <w:pPr>
+              <w:jc w:val="left"/>
+            </w:pPr>
+            <w:r>
+              <w:rPr>
+                <w:sz w:val="15"/>
+              </w:rPr>
+              <w:t>Motion</w:t>
+            </w:r>
+          </w:p>
+        </w:tc>
+        <w:tc>
+          <w:tcPr>
+            <w:tcW w:type="dxa" w:w="1680"/>
+            <w:tcMar>
+              <w:top w:w="85" w:type="dxa"/>
+              <w:start w:w="120" w:type="dxa"/>
+              <w:bottom w:w="85" w:type="dxa"/>
+              <w:end w:w="120" w:type="dxa"/>
+            </w:tcMar>
+            <w:vAlign w:val="center"/>
+          </w:tcPr>
+          <w:p>
+            <w:pPr>
+              <w:jc w:val="center"/>
+            </w:pPr>
+            <w:r>
+              <w:rPr>
+                <w:sz w:val="15"/>
+              </w:rPr>
+              <w:t>EQUIVALENT</w:t>
+            </w:r>
+          </w:p>
+        </w:tc>
+        <w:tc>
+          <w:tcPr>
+            <w:tcW w:type="dxa" w:w="5230"/>
+            <w:tcMar>
+              <w:top w:w="85" w:type="dxa"/>
+              <w:start w:w="120" w:type="dxa"/>
+              <w:bottom w:w="85" w:type="dxa"/>
+              <w:end w:w="120" w:type="dxa"/>
+            </w:tcMar>
+            <w:vAlign w:val="center"/>
+          </w:tcPr>
+          <w:p>
+            <w:pPr>
+              <w:jc w:val="left"/>
+            </w:pPr>
+            <w:r>
+              <w:rPr>
+                <w:sz w:val="15"/>
+              </w:rPr>
+              <w:t>Radial contraction, longitudinal shortening and torsion deform the ellipsoid-associated points; nine independent positions plus a closure frame are preserved.</w:t>
+            </w:r>
+          </w:p>
+        </w:tc>
+      </w:tr>
+      <w:tr>
+        <w:trPr>
+          <w:cantSplit/>
+        </w:trPr>
+        <w:tc>
+          <w:tcPr>
+            <w:tcW w:type="dxa" w:w="2450"/>
+            <w:tcMar>
+              <w:top w:w="85" w:type="dxa"/>
+              <w:start w:w="120" w:type="dxa"/>
+              <w:bottom w:w="85" w:type="dxa"/>
+              <w:end w:w="120" w:type="dxa"/>
+            </w:tcMar>
+            <w:vAlign w:val="center"/>
+          </w:tcPr>
+          <w:p>
+            <w:pPr>
+              <w:jc w:val="left"/>
+            </w:pPr>
+            <w:r>
+              <w:rPr>
+                <w:sz w:val="15"/>
+              </w:rPr>
+              <w:t>RCA</w:t>
+            </w:r>
+          </w:p>
+        </w:tc>
+        <w:tc>
+          <w:tcPr>
+            <w:tcW w:type="dxa" w:w="1680"/>
+            <w:tcMar>
+              <w:top w:w="85" w:type="dxa"/>
+              <w:start w:w="120" w:type="dxa"/>
+              <w:bottom w:w="85" w:type="dxa"/>
+              <w:end w:w="120" w:type="dxa"/>
+            </w:tcMar>
+            <w:vAlign w:val="center"/>
+          </w:tcPr>
+          <w:p>
+            <w:pPr>
+              <w:jc w:val="center"/>
+            </w:pPr>
+            <w:r>
+              <w:rPr>
+                <w:sz w:val="15"/>
+              </w:rPr>
+              <w:t>DELIBERATE DATASET DEVIATION</w:t>
+            </w:r>
+          </w:p>
+        </w:tc>
+        <w:tc>
+          <w:tcPr>
+            <w:tcW w:type="dxa" w:w="5230"/>
+            <w:tcMar>
+              <w:top w:w="85" w:type="dxa"/>
+              <w:start w:w="120" w:type="dxa"/>
+              <w:bottom w:w="85" w:type="dxa"/>
+              <w:end w:w="120" w:type="dxa"/>
+            </w:tcMar>
+            <w:vAlign w:val="center"/>
+          </w:tcPr>
+          <w:p>
+            <w:pPr>
+              <w:jc w:val="left"/>
+            </w:pPr>
+            <w:r>
+              <w:rPr>
+                <w:sz w:val="15"/>
+              </w:rPr>
+              <w:t>Disconnected candidates are not sufficiently reliable annotated RCA identity for population training.</w:t>
+            </w:r>
+          </w:p>
+        </w:tc>
+      </w:tr>
+      <w:tr>
+        <w:trPr>
+          <w:cantSplit/>
+        </w:trPr>
+        <w:tc>
+          <w:tcPr>
+            <w:tcW w:type="dxa" w:w="2450"/>
+            <w:tcMar>
+              <w:top w:w="85" w:type="dxa"/>
+              <w:start w:w="120" w:type="dxa"/>
+              <w:bottom w:w="85" w:type="dxa"/>
+              <w:end w:w="120" w:type="dxa"/>
+            </w:tcMar>
+            <w:vAlign w:val="center"/>
+          </w:tcPr>
+          <w:p>
+            <w:pPr>
+              <w:jc w:val="left"/>
+            </w:pPr>
+            <w:r>
+              <w:rPr>
+                <w:sz w:val="15"/>
+              </w:rPr>
+              <w:t>Side branches</w:t>
+            </w:r>
+          </w:p>
+        </w:tc>
+        <w:tc>
+          <w:tcPr>
+            <w:tcW w:type="dxa" w:w="1680"/>
+            <w:tcMar>
+              <w:top w:w="85" w:type="dxa"/>
+              <w:start w:w="120" w:type="dxa"/>
+              <w:bottom w:w="85" w:type="dxa"/>
+              <w:end w:w="120" w:type="dxa"/>
+            </w:tcMar>
+            <w:vAlign w:val="center"/>
+          </w:tcPr>
+          <w:p>
+            <w:pPr>
+              <w:jc w:val="center"/>
+            </w:pPr>
+            <w:r>
+              <w:rPr>
+                <w:sz w:val="15"/>
+              </w:rPr>
+              <w:t>NOT IMPLEMENTED</w:t>
+            </w:r>
+          </w:p>
+        </w:tc>
+        <w:tc>
+          <w:tcPr>
+            <w:tcW w:type="dxa" w:w="5230"/>
+            <w:tcMar>
+              <w:top w:w="85" w:type="dxa"/>
+              <w:start w:w="120" w:type="dxa"/>
+              <w:bottom w:w="85" w:type="dxa"/>
+              <w:end w:w="120" w:type="dxa"/>
+            </w:tcMar>
+            <w:vAlign w:val="center"/>
+          </w:tcPr>
+          <w:p>
+            <w:pPr>
+              <w:jc w:val="left"/>
+            </w:pPr>
+            <w:r>
+              <w:rPr>
+                <w:sz w:val="15"/>
+              </w:rPr>
+              <w:t>No population-derived identities were sufficiently validated; random branches are not fabricated.</w:t>
+            </w:r>
+          </w:p>
+        </w:tc>
+      </w:tr>
+    </w:tbl>
+    <w:p>
+      <w:pPr>
+        <w:spacing w:after="0"/>
+      </w:pPr>
+    </w:p>
+    <w:p>
+      <w:r>
+        <w:t>The real 52-case surface evidence gives LAD net v progression 1.111 +/- 0.553 rad and LCX total circumferential u travel 1.147 +/- 0.376 rad. The accepted generated cohort has 40/52 cases satisfying the deliberately strict combined surface-role descriptor; the other 12 retain verified eligible real-baseline variation. No PCA, frame, spline/reconstruction, or validator drift was found, so the frozen cohort was not regenerated.</w:t>
+      </w:r>
+    </w:p>
+    <w:p>
+      <w:pPr>
+        <w:keepNext/>
+        <w:jc w:val="center"/>
+      </w:pPr>
+      <w:r>
+        <w:drawing>
+          <wp:inline xmlns:a="http://schemas.openxmlformats.org/drawingml/2006/main" xmlns:pic="http://schemas.openxmlformats.org/drawingml/2006/picture">
+            <wp:extent cx="5897880" cy="3317558"/>
+            <wp:docPr id="2" name="Picture 2" title="Technical design alignment: measured planes and ellipse dimensions define the ellipsoid scaffold; LAD and LCX are then represented and assessed by their surface-relative u-v trajectories before 3D reconstruction." descr="Technical design alignment: measured planes and ellipse dimensions define the ellipsoid scaffold; LAD and LCX are then represented and assessed by their surface-relative u-v trajectories before 3D reconstruction."/>
+            <wp:cNvGraphicFramePr>
+              <a:graphicFrameLocks noChangeAspect="1"/>
+            </wp:cNvGraphicFramePr>
+            <a:graphic>
+              <a:graphicData uri="http://schemas.openxmlformats.org/drawingml/2006/picture">
+                <pic:pic>
+                  <pic:nvPicPr>
+                    <pic:cNvPr id="0" name="00_full_surface_design_concept.png"/>
+                    <pic:cNvPicPr/>
+                  </pic:nvPicPr>
+                  <pic:blipFill>
+                    <a:blip r:embed="rId12"/>
+                    <a:stretch>
+                      <a:fillRect/>
+                    </a:stretch>
+                  </pic:blipFill>
+                  <pic:spPr>
+                    <a:xfrm>
+                      <a:off x="0" y="0"/>
+                      <a:ext cx="5897880" cy="3317558"/>
+                    </a:xfrm>
+                    <a:prstGeom prst="rect"/>
+                  </pic:spPr>
+                </pic:pic>
+              </a:graphicData>
+            </a:graphic>
+          </wp:inline>
+        </w:drawing>
+      </w:r>
+    </w:p>
+    <w:p>
+      <w:pPr>
+        <w:pStyle w:val="Caption"/>
+        <w:keepNext w:val="0"/>
+        <w:jc w:val="center"/>
+      </w:pPr>
+      <w:r>
+        <w:rPr>
+          <w:i/>
+        </w:rPr>
+        <w:t>Technical design alignment: measured planes and ellipse dimensions define the ellipsoid scaffold; LAD and LCX are then represented and assessed by their surface-relative u-v trajectories before 3D reconstruction.</w:t>
+      </w:r>
+    </w:p>
+    <w:p>
+      <w:pPr>
         <w:pStyle w:val="Heading1"/>
         <w:pageBreakBefore/>
       </w:pPr>
       <w:r>
         <w:t>5. Statistical shape model and training population</w:t>
+      </w:r>
+    </w:p>
+    <w:p>
+      <w:r>
+        <w:t>The primary 81-dimensional PCA is not raw cardiac XYZ. It is the specification-faithful LCA-only joint surface-deviation model: 27 fixed points, each represented by tangent-u, tangent-v, and normal coefficients relative to its case-specific ellipsoid. This retains within-vessel and cross-vessel covariance while the ellipsoid and named u-v-offset landmarks define the global scaffold and endpoints.</w:t>
       </w:r>
     </w:p>
     <w:tbl>
@@ -6258,7 +7029,7 @@
         <w:drawing>
           <wp:inline xmlns:a="http://schemas.openxmlformats.org/drawingml/2006/main" xmlns:pic="http://schemas.openxmlformats.org/drawingml/2006/picture">
             <wp:extent cx="5806440" cy="3297054"/>
-            <wp:docPr id="2" name="Picture 2" title="Figure 1. Retained PCA-score comparison between eligible real references and the final generated cohort." descr="Figure 1. Retained PCA-score comparison between eligible real references and the final generated cohort."/>
+            <wp:docPr id="3" name="Picture 3" title="Figure 1. Retained PCA-score comparison between eligible real references and the final generated cohort." descr="Figure 1. Retained PCA-score comparison between eligible real references and the final generated cohort."/>
             <wp:cNvGraphicFramePr>
               <a:graphicFrameLocks noChangeAspect="1"/>
             </wp:cNvGraphicFramePr>
@@ -6270,7 +7041,7 @@
                     <pic:cNvPicPr/>
                   </pic:nvPicPr>
                   <pic:blipFill>
-                    <a:blip r:embed="rId12"/>
+                    <a:blip r:embed="rId13"/>
                     <a:stretch>
                       <a:fillRect/>
                     </a:stretch>
@@ -6916,7 +7687,7 @@
     </w:p>
     <w:p>
       <w:r>
-        <w:t>The final empirical controls are the fixed 5/12/10 normalized-arc samples. Stable PCHIP Hermite derivatives are converted interval-by-interval to cubic Bezier controls, assembled as a clamped cubic B-spline with repeated interior knots, and evaluated through SciPy BSpline at 60/180/160 dense LMCA/LAD/LCX samples. The first and last points are overwritten with exact controls and the daughter starts are snapped to the LMCA terminal. This is a real B-spline basis representation, not a polyline. Unconstrained global cubic trials were rejected because they introduced hooks and violated learned progression/tortuosity limits. The accepted implementation reproduces the prior stable path to numerical precision while making the spline basis explicit.</w:t>
+        <w:t>The final empirical controls are the fixed 5/12/10 normalized-arc samples. Stable PCHIP Hermite derivatives are converted interval-by-interval to cubic Bezier controls, assembled as a clamped cubic B-spline with repeated interior knots, and evaluated through SciPy BSpline at 60/180/160 dense LMCA/LAD/LCX samples. The first and last points are overwritten with exact controls and the daughter starts are snapped to the LMCA terminal. This is a real B-spline basis representation, not a polyline. Unconstrained global cubic trials were rejected because they introduced hooks and violated learned progression/tortuosity limits. The accepted implementation reproduces the prior stable path to numerical precision while making the spline basis explicit. The protected spline interpolates the fixed controls in cardiac XYZ; every dense sample is then re-parameterized and reconstructed in u, v, offset and the ellipsoid local basis. It is therefore surface-relative, but only partially aligned with a literal global u-v spline because the current LAD chart reaches a polar singularity in 26 of 52 eligible baselines.</w:t>
       </w:r>
     </w:p>
     <w:tbl>
@@ -6978,7 +7749,7 @@
         <w:drawing>
           <wp:inline xmlns:a="http://schemas.openxmlformats.org/drawingml/2006/main" xmlns:pic="http://schemas.openxmlformats.org/drawingml/2006/picture">
             <wp:extent cx="5852160" cy="5301982"/>
-            <wp:docPr id="3" name="Picture 3" title="Figure 2. All 52 accepted trees in a common fixed-scale cardiac X-Z view. Colors are machine-checked: LMCA dark gray, LAD red, LCX teal; negative Z points toward the apex." descr="Figure 2. All 52 accepted trees in a common fixed-scale cardiac X-Z view. Colors are machine-checked: LMCA dark gray, LAD red, LCX teal; negative Z points toward the apex."/>
+            <wp:docPr id="4" name="Picture 4" title="Figure 2. All 52 accepted trees in a common fixed-scale cardiac X-Z view. Colors are machine-checked: LMCA dark gray, LAD red, LCX teal; negative Z points toward the apex." descr="Figure 2. All 52 accepted trees in a common fixed-scale cardiac X-Z view. Colors are machine-checked: LMCA dark gray, LAD red, LCX teal; negative Z points toward the apex."/>
             <wp:cNvGraphicFramePr>
               <a:graphicFrameLocks noChangeAspect="1"/>
             </wp:cNvGraphicFramePr>
@@ -6990,7 +7761,7 @@
                     <pic:cNvPicPr/>
                   </pic:nvPicPr>
                   <pic:blipFill>
-                    <a:blip r:embed="rId13"/>
+                    <a:blip r:embed="rId14"/>
                     <a:stretch>
                       <a:fillRect/>
                     </a:stretch>
@@ -7031,7 +7802,7 @@
         <w:drawing>
           <wp:inline xmlns:a="http://schemas.openxmlformats.org/drawingml/2006/main" xmlns:pic="http://schemas.openxmlformats.org/drawingml/2006/picture">
             <wp:extent cx="5852160" cy="4512027"/>
-            <wp:docPr id="4" name="Picture 4" title="Selected 3D audit views include low-margin, typical, and specifically requested trees 0036 and 0052; apparent 2D crossings are assessed with 3D clearance metrics." descr="Selected 3D audit views include low-margin, typical, and specifically requested trees 0036 and 0052; apparent 2D crossings are assessed with 3D clearance metrics."/>
+            <wp:docPr id="5" name="Picture 5" title="Selected 3D audit views include low-margin, typical, and specifically requested trees 0036 and 0052; apparent 2D crossings are assessed with 3D clearance metrics." descr="Selected 3D audit views include low-margin, typical, and specifically requested trees 0036 and 0052; apparent 2D crossings are assessed with 3D clearance metrics."/>
             <wp:cNvGraphicFramePr>
               <a:graphicFrameLocks noChangeAspect="1"/>
             </wp:cNvGraphicFramePr>
@@ -7043,7 +7814,7 @@
                     <pic:cNvPicPr/>
                   </pic:nvPicPr>
                   <pic:blipFill>
-                    <a:blip r:embed="rId14"/>
+                    <a:blip r:embed="rId15"/>
                     <a:stretch>
                       <a:fillRect/>
                     </a:stretch>
@@ -7084,7 +7855,7 @@
         <w:drawing>
           <wp:inline xmlns:a="http://schemas.openxmlformats.org/drawingml/2006/main" xmlns:pic="http://schemas.openxmlformats.org/drawingml/2006/picture">
             <wp:extent cx="5852160" cy="4402507"/>
-            <wp:docPr id="5" name="Picture 5" title="Figure 3. Real-versus-generated length, angle, tortuosity, landmark, and scaffold distributions." descr="Figure 3. Real-versus-generated length, angle, tortuosity, landmark, and scaffold distributions."/>
+            <wp:docPr id="6" name="Picture 6" title="Figure 3. Real-versus-generated length, angle, tortuosity, landmark, and scaffold distributions." descr="Figure 3. Real-versus-generated length, angle, tortuosity, landmark, and scaffold distributions."/>
             <wp:cNvGraphicFramePr>
               <a:graphicFrameLocks noChangeAspect="1"/>
             </wp:cNvGraphicFramePr>
@@ -7096,7 +7867,7 @@
                     <pic:cNvPicPr/>
                   </pic:nvPicPr>
                   <pic:blipFill>
-                    <a:blip r:embed="rId15"/>
+                    <a:blip r:embed="rId16"/>
                     <a:stretch>
                       <a:fillRect/>
                     </a:stretch>
@@ -8496,7 +9267,7 @@
         <w:drawing>
           <wp:inline xmlns:a="http://schemas.openxmlformats.org/drawingml/2006/main" xmlns:pic="http://schemas.openxmlformats.org/drawingml/2006/picture">
             <wp:extent cx="5806440" cy="4838700"/>
-            <wp:docPr id="6" name="Picture 6" title="Figure 4. Population motion QC: contraction function, scaffold axes, LAD length variation, and exact junction error." descr="Figure 4. Population motion QC: contraction function, scaffold axes, LAD length variation, and exact junction error."/>
+            <wp:docPr id="7" name="Picture 7" title="Figure 4. Population motion QC: contraction function, scaffold axes, LAD length variation, and exact junction error." descr="Figure 4. Population motion QC: contraction function, scaffold axes, LAD length variation, and exact junction error."/>
             <wp:cNvGraphicFramePr>
               <a:graphicFrameLocks noChangeAspect="1"/>
             </wp:cNvGraphicFramePr>
@@ -8508,7 +9279,7 @@
                     <pic:cNvPicPr/>
                   </pic:nvPicPr>
                   <pic:blipFill>
-                    <a:blip r:embed="rId16"/>
+                    <a:blip r:embed="rId17"/>
                     <a:stretch>
                       <a:fillRect/>
                     </a:stretch>
@@ -9205,7 +9976,7 @@
         <w:drawing>
           <wp:inline xmlns:a="http://schemas.openxmlformats.org/drawingml/2006/main" xmlns:pic="http://schemas.openxmlformats.org/drawingml/2006/picture">
             <wp:extent cx="5806440" cy="2723903"/>
-            <wp:docPr id="7" name="Picture 7" title="Figure 5. Healthy, focal LAD, diffuse LCX, and tandem LAD cases on identical seeded anatomy." descr="Figure 5. Healthy, focal LAD, diffuse LCX, and tandem LAD cases on identical seeded anatomy."/>
+            <wp:docPr id="8" name="Picture 8" title="Figure 5. Healthy, focal LAD, diffuse LCX, and tandem LAD cases on identical seeded anatomy." descr="Figure 5. Healthy, focal LAD, diffuse LCX, and tandem LAD cases on identical seeded anatomy."/>
             <wp:cNvGraphicFramePr>
               <a:graphicFrameLocks noChangeAspect="1"/>
             </wp:cNvGraphicFramePr>
@@ -9217,7 +9988,7 @@
                     <pic:cNvPicPr/>
                   </pic:nvPicPr>
                   <pic:blipFill>
-                    <a:blip r:embed="rId17"/>
+                    <a:blip r:embed="rId18"/>
                     <a:stretch>
                       <a:fillRect/>
                     </a:stretch>
@@ -11242,7 +12013,7 @@
         <w:drawing>
           <wp:inline xmlns:a="http://schemas.openxmlformats.org/drawingml/2006/main" xmlns:pic="http://schemas.openxmlformats.org/drawingml/2006/picture">
             <wp:extent cx="5806440" cy="4838700"/>
-            <wp:docPr id="8" name="Picture 8" title="Figure 6. Standardized export QC and identity evidence for the 52-tree population." descr="Figure 6. Standardized export QC and identity evidence for the 52-tree population."/>
+            <wp:docPr id="9" name="Picture 9" title="Figure 6. Standardized export QC and identity evidence for the 52-tree population." descr="Figure 6. Standardized export QC and identity evidence for the 52-tree population."/>
             <wp:cNvGraphicFramePr>
               <a:graphicFrameLocks noChangeAspect="1"/>
             </wp:cNvGraphicFramePr>
@@ -11254,7 +12025,7 @@
                     <pic:cNvPicPr/>
                   </pic:nvPicPr>
                   <pic:blipFill>
-                    <a:blip r:embed="rId18"/>
+                    <a:blip r:embed="rId19"/>
                     <a:stretch>
                       <a:fillRect/>
                     </a:stretch>
@@ -11733,7 +12504,7 @@
               <w:rPr>
                 <w:sz w:val="18"/>
               </w:rPr>
-              <w:t>92</w:t>
+              <w:t>103</w:t>
             </w:r>
           </w:p>
         </w:tc>
@@ -12489,7 +13260,7 @@
         <w:drawing>
           <wp:inline xmlns:a="http://schemas.openxmlformats.org/drawingml/2006/main" xmlns:pic="http://schemas.openxmlformats.org/drawingml/2006/picture">
             <wp:extent cx="5806440" cy="2339406"/>
-            <wp:docPr id="9" name="Picture 9" title="Canonical geometry/PCA novelty audit." descr="Canonical geometry/PCA novelty audit."/>
+            <wp:docPr id="10" name="Picture 10" title="Canonical geometry/PCA novelty audit." descr="Canonical geometry/PCA novelty audit."/>
             <wp:cNvGraphicFramePr>
               <a:graphicFrameLocks noChangeAspect="1"/>
             </wp:cNvGraphicFramePr>
@@ -12501,7 +13272,7 @@
                     <pic:cNvPicPr/>
                   </pic:nvPicPr>
                   <pic:blipFill>
-                    <a:blip r:embed="rId19"/>
+                    <a:blip r:embed="rId20"/>
                     <a:stretch>
                       <a:fillRect/>
                     </a:stretch>
@@ -12542,7 +13313,7 @@
         <w:drawing>
           <wp:inline xmlns:a="http://schemas.openxmlformats.org/drawingml/2006/main" xmlns:pic="http://schemas.openxmlformats.org/drawingml/2006/picture">
             <wp:extent cx="5806440" cy="2383155"/>
-            <wp:docPr id="10" name="Picture 10" title="Source-grouped five-fold internal holdout evidence." descr="Source-grouped five-fold internal holdout evidence."/>
+            <wp:docPr id="11" name="Picture 11" title="Source-grouped five-fold internal holdout evidence." descr="Source-grouped five-fold internal holdout evidence."/>
             <wp:cNvGraphicFramePr>
               <a:graphicFrameLocks noChangeAspect="1"/>
             </wp:cNvGraphicFramePr>
@@ -12554,7 +13325,7 @@
                     <pic:cNvPicPr/>
                   </pic:nvPicPr>
                   <pic:blipFill>
-                    <a:blip r:embed="rId20"/>
+                    <a:blip r:embed="rId21"/>
                     <a:stretch>
                       <a:fillRect/>
                     </a:stretch>
@@ -13653,7 +14424,7 @@
         <w:drawing>
           <wp:inline xmlns:a="http://schemas.openxmlformats.org/drawingml/2006/main" xmlns:pic="http://schemas.openxmlformats.org/drawingml/2006/picture">
             <wp:extent cx="5806440" cy="4264250"/>
-            <wp:docPr id="11" name="Picture 11" title="Figure 7. Healthy representative anatomy, topology, radii, motion, pulsatility, and tortuosity dashboard." descr="Figure 7. Healthy representative anatomy, topology, radii, motion, pulsatility, and tortuosity dashboard."/>
+            <wp:docPr id="12" name="Picture 12" title="Figure 7. Healthy representative anatomy, topology, radii, motion, pulsatility, and tortuosity dashboard." descr="Figure 7. Healthy representative anatomy, topology, radii, motion, pulsatility, and tortuosity dashboard."/>
             <wp:cNvGraphicFramePr>
               <a:graphicFrameLocks noChangeAspect="1"/>
             </wp:cNvGraphicFramePr>
@@ -13665,7 +14436,7 @@
                     <pic:cNvPicPr/>
                   </pic:nvPicPr>
                   <pic:blipFill>
-                    <a:blip r:embed="rId21"/>
+                    <a:blip r:embed="rId22"/>
                     <a:stretch>
                       <a:fillRect/>
                     </a:stretch>
@@ -13706,7 +14477,7 @@
         <w:drawing>
           <wp:inline xmlns:a="http://schemas.openxmlformats.org/drawingml/2006/main" xmlns:pic="http://schemas.openxmlformats.org/drawingml/2006/picture">
             <wp:extent cx="5806440" cy="4264250"/>
-            <wp:docPr id="12" name="Picture 12" title="Figure 8. Focal LAD validation dashboard showing localized radius loss with unchanged centerline geometry." descr="Figure 8. Focal LAD validation dashboard showing localized radius loss with unchanged centerline geometry."/>
+            <wp:docPr id="13" name="Picture 13" title="Figure 8. Focal LAD validation dashboard showing localized radius loss with unchanged centerline geometry." descr="Figure 8. Focal LAD validation dashboard showing localized radius loss with unchanged centerline geometry."/>
             <wp:cNvGraphicFramePr>
               <a:graphicFrameLocks noChangeAspect="1"/>
             </wp:cNvGraphicFramePr>
@@ -13718,7 +14489,7 @@
                     <pic:cNvPicPr/>
                   </pic:nvPicPr>
                   <pic:blipFill>
-                    <a:blip r:embed="rId22"/>
+                    <a:blip r:embed="rId23"/>
                     <a:stretch>
                       <a:fillRect/>
                     </a:stretch>
@@ -14284,7 +15055,7 @@
         <w:drawing>
           <wp:inline xmlns:a="http://schemas.openxmlformats.org/drawingml/2006/main" xmlns:pic="http://schemas.openxmlformats.org/drawingml/2006/picture">
             <wp:extent cx="5806440" cy="3870960"/>
-            <wp:docPr id="13" name="Picture 13" title="Figure 9. Quantitative focal-LAD motion and pulsatility audit, including reduced lesion response." descr="Figure 9. Quantitative focal-LAD motion and pulsatility audit, including reduced lesion response."/>
+            <wp:docPr id="14" name="Picture 14" title="Figure 9. Quantitative focal-LAD motion and pulsatility audit, including reduced lesion response." descr="Figure 9. Quantitative focal-LAD motion and pulsatility audit, including reduced lesion response."/>
             <wp:cNvGraphicFramePr>
               <a:graphicFrameLocks noChangeAspect="1"/>
             </wp:cNvGraphicFramePr>
@@ -14296,7 +15067,7 @@
                     <pic:cNvPicPr/>
                   </pic:nvPicPr>
                   <pic:blipFill>
-                    <a:blip r:embed="rId23"/>
+                    <a:blip r:embed="rId24"/>
                     <a:stretch>
                       <a:fillRect/>
                     </a:stretch>
@@ -14342,7 +15113,7 @@
         <w:drawing>
           <wp:inline xmlns:a="http://schemas.openxmlformats.org/drawingml/2006/main" xmlns:pic="http://schemas.openxmlformats.org/drawingml/2006/picture">
             <wp:extent cx="5806440" cy="1735024"/>
-            <wp:docPr id="14" name="Picture 14" title="Figure 10. Branch-specific curvature and distance-metric tortuosity for the shared representative anatomy." descr="Figure 10. Branch-specific curvature and distance-metric tortuosity for the shared representative anatomy."/>
+            <wp:docPr id="15" name="Picture 15" title="Figure 10. Branch-specific curvature and distance-metric tortuosity for the shared representative anatomy." descr="Figure 10. Branch-specific curvature and distance-metric tortuosity for the shared representative anatomy."/>
             <wp:cNvGraphicFramePr>
               <a:graphicFrameLocks noChangeAspect="1"/>
             </wp:cNvGraphicFramePr>
@@ -14354,7 +15125,7 @@
                     <pic:cNvPicPr/>
                   </pic:nvPicPr>
                   <pic:blipFill>
-                    <a:blip r:embed="rId24"/>
+                    <a:blip r:embed="rId25"/>
                     <a:stretch>
                       <a:fillRect/>
                     </a:stretch>
@@ -16662,7 +17433,7 @@
               <w:rPr>
                 <w:sz w:val="17"/>
               </w:rPr>
-              <w:t>92 tests, 50/50 comparisons, zero warnings</w:t>
+              <w:t>103 tests, 50/50 comparisons, zero warnings</w:t>
             </w:r>
           </w:p>
         </w:tc>
@@ -17679,7 +18450,7 @@
         <w:drawing>
           <wp:inline xmlns:a="http://schemas.openxmlformats.org/drawingml/2006/main" xmlns:pic="http://schemas.openxmlformats.org/drawingml/2006/picture">
             <wp:extent cx="5852160" cy="1827708"/>
-            <wp:docPr id="15" name="Picture 15" title="Uniform 1 mm arc-length curvature comparison. P95/P99 are descriptive cohort evidence; no arbitrary clinical curvature limit is imposed." descr="Uniform 1 mm arc-length curvature comparison. P95/P99 are descriptive cohort evidence; no arbitrary clinical curvature limit is imposed."/>
+            <wp:docPr id="16" name="Picture 16" title="Uniform 1 mm arc-length curvature comparison. P95/P99 are descriptive cohort evidence; no arbitrary clinical curvature limit is imposed." descr="Uniform 1 mm arc-length curvature comparison. P95/P99 are descriptive cohort evidence; no arbitrary clinical curvature limit is imposed."/>
             <wp:cNvGraphicFramePr>
               <a:graphicFrameLocks noChangeAspect="1"/>
             </wp:cNvGraphicFramePr>
@@ -17691,7 +18462,7 @@
                     <pic:cNvPicPr/>
                   </pic:nvPicPr>
                   <pic:blipFill>
-                    <a:blip r:embed="rId25"/>
+                    <a:blip r:embed="rId26"/>
                     <a:stretch>
                       <a:fillRect/>
                     </a:stretch>
@@ -17749,7 +18520,7 @@
       <w:r>
         <w:t xml:space="preserve">Manpoong et al., Detailed Morphometric Analysis on Left Coronary Artery in the Population of North-East India, 2023. </w:t>
       </w:r>
-      <w:hyperlink r:id="rId26">
+      <w:hyperlink r:id="rId27">
         <w:r>
           <w:rPr>
             <w:color w:val="1A73E8"/>
@@ -17774,7 +18545,7 @@
       <w:r>
         <w:t xml:space="preserve">Lujinovic et al., Morphometric analysis of clinically significant parameters of the main trunk of the left coronary artery, 2023. </w:t>
       </w:r>
-      <w:hyperlink r:id="rId27">
+      <w:hyperlink r:id="rId28">
         <w:r>
           <w:rPr>
             <w:color w:val="1A73E8"/>
@@ -17799,7 +18570,7 @@
       <w:r>
         <w:t xml:space="preserve">Pflederer et al., Measurement of coronary artery bifurcation angles by multidetector computed tomography, 2006. </w:t>
       </w:r>
-      <w:hyperlink r:id="rId28">
+      <w:hyperlink r:id="rId29">
         <w:r>
           <w:rPr>
             <w:color w:val="1A73E8"/>
@@ -17824,7 +18595,7 @@
       <w:r>
         <w:t xml:space="preserve">Paul et al., A milestone in prediction of the coronary artery dimensions, 2019. </w:t>
       </w:r>
-      <w:hyperlink r:id="rId29">
+      <w:hyperlink r:id="rId30">
         <w:r>
           <w:rPr>
             <w:color w:val="1A73E8"/>
@@ -17849,7 +18620,7 @@
       <w:r>
         <w:t xml:space="preserve">Tan et al., Estimation of the displacement of cardiac substructures and the motion of the coronary arteries using ECG gating, 2013. </w:t>
       </w:r>
-      <w:hyperlink r:id="rId30">
+      <w:hyperlink r:id="rId31">
         <w:r>
           <w:rPr>
             <w:color w:val="1A73E8"/>
@@ -17874,7 +18645,7 @@
       <w:r>
         <w:t xml:space="preserve">Ge et al., Intravascular ultrasound imaging of angiographically normal coronary arteries, 1994. </w:t>
       </w:r>
-      <w:hyperlink r:id="rId31">
+      <w:hyperlink r:id="rId32">
         <w:r>
           <w:rPr>
             <w:color w:val="1A73E8"/>
@@ -17899,7 +18670,7 @@
       <w:r>
         <w:t xml:space="preserve">Nakatani et al., Assessment of coronary artery distensibility by intravascular ultrasound, 1995. </w:t>
       </w:r>
-      <w:hyperlink r:id="rId32">
+      <w:hyperlink r:id="rId33">
         <w:r>
           <w:rPr>
             <w:color w:val="1A73E8"/>
@@ -17924,7 +18695,7 @@
       <w:r>
         <w:t xml:space="preserve">Numao et al., Pulsatile diameter change of coronary artery lumen estimated by IVUS, 1997. </w:t>
       </w:r>
-      <w:hyperlink r:id="rId33">
+      <w:hyperlink r:id="rId34">
         <w:r>
           <w:rPr>
             <w:color w:val="1A73E8"/>
@@ -19117,6 +19888,108 @@
                 <w:sz w:val="17"/>
               </w:rPr>
               <w:t>Per-tree quantitative DOCX reports retained as supporting evidence.</w:t>
+            </w:r>
+          </w:p>
+        </w:tc>
+      </w:tr>
+      <w:tr>
+        <w:trPr>
+          <w:cantSplit/>
+        </w:trPr>
+        <w:tc>
+          <w:tcPr>
+            <w:tcW w:type="dxa" w:w="3700"/>
+            <w:tcMar>
+              <w:top w:w="85" w:type="dxa"/>
+              <w:start w:w="120" w:type="dxa"/>
+              <w:bottom w:w="85" w:type="dxa"/>
+              <w:end w:w="120" w:type="dxa"/>
+            </w:tcMar>
+            <w:vAlign w:val="center"/>
+          </w:tcPr>
+          <w:p>
+            <w:pPr>
+              <w:jc w:val="left"/>
+            </w:pPr>
+            <w:r>
+              <w:rPr>
+                <w:sz w:val="17"/>
+              </w:rPr>
+              <w:t>submission_release/design_spec_alignment/</w:t>
+            </w:r>
+          </w:p>
+        </w:tc>
+        <w:tc>
+          <w:tcPr>
+            <w:tcW w:type="dxa" w:w="5660"/>
+            <w:tcMar>
+              <w:top w:w="85" w:type="dxa"/>
+              <w:start w:w="120" w:type="dxa"/>
+              <w:bottom w:w="85" w:type="dxa"/>
+              <w:end w:w="120" w:type="dxa"/>
+            </w:tcMar>
+            <w:vAlign w:val="center"/>
+          </w:tcPr>
+          <w:p>
+            <w:pPr>
+              <w:jc w:val="left"/>
+            </w:pPr>
+            <w:r>
+              <w:rPr>
+                <w:sz w:val="17"/>
+              </w:rPr>
+              <w:t>Requirement matrix, ellipse-to-ellipsoid provenance, point-level surface trace, real/generated u-v audits, spline-equivalence evaluation, figures, and final alignment report.</w:t>
+            </w:r>
+          </w:p>
+        </w:tc>
+      </w:tr>
+      <w:tr>
+        <w:trPr>
+          <w:cantSplit/>
+        </w:trPr>
+        <w:tc>
+          <w:tcPr>
+            <w:tcW w:type="dxa" w:w="3700"/>
+            <w:tcMar>
+              <w:top w:w="85" w:type="dxa"/>
+              <w:start w:w="120" w:type="dxa"/>
+              <w:bottom w:w="85" w:type="dxa"/>
+              <w:end w:w="120" w:type="dxa"/>
+            </w:tcMar>
+            <w:vAlign w:val="center"/>
+          </w:tcPr>
+          <w:p>
+            <w:pPr>
+              <w:jc w:val="left"/>
+            </w:pPr>
+            <w:r>
+              <w:rPr>
+                <w:sz w:val="17"/>
+              </w:rPr>
+              <w:t>submission_release/mentor_visualization_pack/</w:t>
+            </w:r>
+          </w:p>
+        </w:tc>
+        <w:tc>
+          <w:tcPr>
+            <w:tcW w:type="dxa" w:w="5660"/>
+            <w:tcMar>
+              <w:top w:w="85" w:type="dxa"/>
+              <w:start w:w="120" w:type="dxa"/>
+              <w:bottom w:w="85" w:type="dxa"/>
+              <w:end w:w="120" w:type="dxa"/>
+            </w:tcMar>
+            <w:vAlign w:val="center"/>
+          </w:tcPr>
+          <w:p>
+            <w:pPr>
+              <w:jc w:val="left"/>
+            </w:pPr>
+            <w:r>
+              <w:rPr>
+                <w:sz w:val="17"/>
+              </w:rPr>
+              <w:t>Self-contained ParaView pack with all 52 static trees, four 10-frame disease/motion cine series, referenced VTK dependencies, presentation assets, checksums, and a viewing guide.</w:t>
             </w:r>
           </w:p>
         </w:tc>
@@ -19344,7 +20217,7 @@
         <w:pStyle w:val="ListBullet"/>
       </w:pPr>
       <w:r>
-        <w:t>PASS - All 92 regression checks pass; compileall and dependency checks pass.</w:t>
+        <w:t>PASS - All 103 regression checks pass; compileall and dependency checks pass.</w:t>
       </w:r>
     </w:p>
     <w:p>

</xml_diff>